<commit_message>
Fix: cap nhat code do an va loai bo hoan toan file mat ma
</commit_message>
<xml_diff>
--- a/Word/NCKH_NguyenVanHo_2026_222520.docx
+++ b/Word/NCKH_NguyenVanHo_2026_222520.docx
@@ -84,17 +84,7 @@
           <w:i/>
           <w:iCs/>
         </w:rPr>
-        <w:t xml:space="preserve">School of Digital Technology and Artificial Intelligence, Nam Can Tho University, </w:t>
-      </w:r>
-      <w:bookmarkStart w:id="0" w:name="_GoBack"/>
-      <w:bookmarkEnd w:id="0"/>
-      <w:r>
-        <w:rPr>
-          <w:rFonts w:asciiTheme="majorHAnsi" w:hAnsiTheme="majorHAnsi" w:cstheme="majorHAnsi"/>
-          <w:i/>
-          <w:iCs/>
-        </w:rPr>
-        <w:t>Can Tho, Vietnam</w:t>
+        <w:t>School of Digital Technology and Artificial Intelligence, Nam Can Tho University, Can Tho, Vietnam</w:t>
       </w:r>
     </w:p>
     <w:p>
@@ -5800,7 +5790,13 @@
         <w:rPr>
           <w:rFonts w:asciiTheme="majorHAnsi" w:hAnsiTheme="majorHAnsi" w:cstheme="majorHAnsi"/>
         </w:rPr>
-        <w:t>[14] A.-K. NGO-HO, A.-K. NGO-HO, and K.-D. VO, "GVEC: A Vietnamese Large Language Models Chatbot For Economy, Using Vietnamese Economy Information Database (VEID) From Vneconomy Community," in Proceedings of the 7th International Conference on Multimedia Analysis and Pattern Recognition (MAPR 2024), Hanoi, Vietnam, 2024.</w:t>
+        <w:t>[14] A.-K. Ngo-Ho, A.-K. Ngo-Ho, and K.-D. Vo, "GVEC: A Vietnamese large language models chatbot for economy, using Vietnamese Economy Information Database (VEID) from Vneconomy community," in Proceedings of the 7th International Conference on Multimedia Analysis and Pattern Recognition (MA</w:t>
+      </w:r>
+      <w:r>
+        <w:rPr>
+          <w:rFonts w:asciiTheme="majorHAnsi" w:hAnsiTheme="majorHAnsi" w:cstheme="majorHAnsi"/>
+        </w:rPr>
+        <w:t>PR 2024), Hanoi, Vietnam, 2024.</w:t>
       </w:r>
     </w:p>
     <w:p>
@@ -5815,7 +5811,13 @@
         <w:rPr>
           <w:rFonts w:asciiTheme="majorHAnsi" w:hAnsiTheme="majorHAnsi" w:cstheme="majorHAnsi"/>
         </w:rPr>
-        <w:t>[15] A.-K. NGO-HO, A.-K. NGO-HO, and K.-D. VO, "GVEC: Generative Vietnamese Economy Chatbots using Vietnamese Numeric Economy Information Question/Answer Dataset (VNEIQAD) benchmark," in Proceedings of the 17th International Conference on Advanced Technologies for Communications (ATC 2024), Hanoi, Vietnam, 2024.</w:t>
+        <w:t>[15] A.-K. Ngo-Ho, A.-K. Ngo-Ho, and K.-D. Vo, "GVEC: Generative Vietnamese economy chatbots using Vietnamese Numeric Economy Information Question/Answer Dataset (VNEIQAD) benchmark," in Proceedings of the 17th International Conference on Advanced Technologies for Communications (A</w:t>
+      </w:r>
+      <w:r>
+        <w:rPr>
+          <w:rFonts w:asciiTheme="majorHAnsi" w:hAnsiTheme="majorHAnsi" w:cstheme="majorHAnsi"/>
+        </w:rPr>
+        <w:t>TC 2024), Hanoi, Vietnam, 2024.</w:t>
       </w:r>
     </w:p>
     <w:p>
@@ -5830,7 +5832,13 @@
         <w:rPr>
           <w:rFonts w:asciiTheme="majorHAnsi" w:hAnsiTheme="majorHAnsi" w:cstheme="majorHAnsi"/>
         </w:rPr>
-        <w:t>[16] A.-K. NGO-HO, K.-D. VO, and A.-K. NGO-HO, "Evaluation of Large Language Models for the Vietnamese Language in Generative Vietnamese Economy Chatbots (GVEC) Services," in 6th International Conference on Electronics and Signal Processing (ICESP 2024), S. Yeom, Ed. Cham: Springer, 2025. doi: 10.1007/978-3-031-94973-9_19.</w:t>
+        <w:t>[16] A.-K. Ngo-Ho, K.-D. Vo, and A.-K. Ngo-Ho, "Evaluation of large language models for the Vietnamese language in Generative Vietnamese Economy Chatbots (GVEC) services," in 6th International Conference on Electronics and Signal Processing (ICESP 2024), S. Yeom, Ed. Cham, Switzerland: Springer, 2025. doi</w:t>
+      </w:r>
+      <w:r>
+        <w:rPr>
+          <w:rFonts w:asciiTheme="majorHAnsi" w:hAnsiTheme="majorHAnsi" w:cstheme="majorHAnsi"/>
+        </w:rPr>
+        <w:t>: 10.1007/978-3-031-94973-9_19.</w:t>
       </w:r>
     </w:p>
     <w:p>
@@ -5845,7 +5853,15 @@
         <w:rPr>
           <w:rFonts w:asciiTheme="majorHAnsi" w:hAnsiTheme="majorHAnsi" w:cstheme="majorHAnsi"/>
         </w:rPr>
-        <w:t>[17] A.-K. NGO-HO, K.-D. VO, and A.-K. NGO-HO, "VQABG: Vietnamese question/answers benchmark generator for field-specific chatbot ground-truth dataset using EMINI (Exact Match wIth Numeric Information) indicator," CTU Journal of Innovation and Sustainable Development, vol. 16, no. Special issue: ISDS, pp. 80-90, 2024. doi: 10.22144/ctujoisd.2024.325.</w:t>
+        <w:t>[17] A.-K. Ngo-Ho, K.-D. Vo, and A.-K. Ngo-Ho, "VQABG: Vietnamese question/answers benchmark generator for field-specific chatbot ground-truth dataset using EMINI (Exact Match wIth Numeric Information) indicator," CTU Journal of Innovation and Sustainable Development, vol. 16, no. Special Issue: ISDS, pp. 80–90, 2024. d</w:t>
+      </w:r>
+      <w:bookmarkStart w:id="0" w:name="_GoBack"/>
+      <w:bookmarkEnd w:id="0"/>
+      <w:r>
+        <w:rPr>
+          <w:rFonts w:asciiTheme="majorHAnsi" w:hAnsiTheme="majorHAnsi" w:cstheme="majorHAnsi"/>
+        </w:rPr>
+        <w:t>oi: 10.22144/ctujoisd.2024.325.</w:t>
       </w:r>
     </w:p>
     <w:sectPr>
@@ -8291,7 +8307,7 @@
 </file>
 
 <file path=customXml/itemProps1.xml><?xml version="1.0" encoding="utf-8"?>
-<ds:datastoreItem xmlns:ds="http://schemas.openxmlformats.org/officeDocument/2006/customXml" ds:itemID="{9378FD4E-D658-4C2D-91B9-FCF01AC6618E}">
+<ds:datastoreItem xmlns:ds="http://schemas.openxmlformats.org/officeDocument/2006/customXml" ds:itemID="{759B2BB9-2E56-4AA7-8579-A161D47E0996}">
   <ds:schemaRefs>
     <ds:schemaRef ds:uri="http://schemas.openxmlformats.org/officeDocument/2006/bibliography"/>
   </ds:schemaRefs>

</xml_diff>

<commit_message>
Update bao cao khoa luan Word
</commit_message>
<xml_diff>
--- a/Word/NCKH_NguyenVanHo_2026_222520.docx
+++ b/Word/NCKH_NguyenVanHo_2026_222520.docx
@@ -14,6 +14,7 @@
           <w:szCs w:val="36"/>
         </w:rPr>
       </w:pPr>
+      <w:bookmarkStart w:id="0" w:name="_GoBack"/>
       <w:r>
         <w:rPr>
           <w:rFonts w:asciiTheme="majorHAnsi" w:hAnsiTheme="majorHAnsi" w:cstheme="majorHAnsi"/>
@@ -22,9 +23,20 @@
           <w:sz w:val="36"/>
           <w:szCs w:val="36"/>
         </w:rPr>
-        <w:t>RAG++: An Advanced Hybrid Retrieval-Augmented Generation Framework for Intelligent Vietnamese Legal Consultation</w:t>
-      </w:r>
-    </w:p>
+        <w:t>RAG++: An Advanced Hybrid Retrieval-Augmented Generation Framework for Intelligent Vietnamese Legal Co</w:t>
+      </w:r>
+      <w:r>
+        <w:rPr>
+          <w:rFonts w:asciiTheme="majorHAnsi" w:hAnsiTheme="majorHAnsi" w:cstheme="majorHAnsi"/>
+          <w:b/>
+          <w:bCs/>
+          <w:sz w:val="36"/>
+          <w:szCs w:val="36"/>
+        </w:rPr>
+        <w:t>nsultations</w:t>
+      </w:r>
+    </w:p>
+    <w:bookmarkEnd w:id="0"/>
     <w:p>
       <w:pPr>
         <w:spacing w:after="120" w:line="276" w:lineRule="auto"/>
@@ -5853,15 +5865,7 @@
         <w:rPr>
           <w:rFonts w:asciiTheme="majorHAnsi" w:hAnsiTheme="majorHAnsi" w:cstheme="majorHAnsi"/>
         </w:rPr>
-        <w:t>[17] A.-K. Ngo-Ho, K.-D. Vo, and A.-K. Ngo-Ho, "VQABG: Vietnamese question/answers benchmark generator for field-specific chatbot ground-truth dataset using EMINI (Exact Match wIth Numeric Information) indicator," CTU Journal of Innovation and Sustainable Development, vol. 16, no. Special Issue: ISDS, pp. 80–90, 2024. d</w:t>
-      </w:r>
-      <w:bookmarkStart w:id="0" w:name="_GoBack"/>
-      <w:bookmarkEnd w:id="0"/>
-      <w:r>
-        <w:rPr>
-          <w:rFonts w:asciiTheme="majorHAnsi" w:hAnsiTheme="majorHAnsi" w:cstheme="majorHAnsi"/>
-        </w:rPr>
-        <w:t>oi: 10.22144/ctujoisd.2024.325.</w:t>
+        <w:t>[17] A.-K. Ngo-Ho, K.-D. Vo, and A.-K. Ngo-Ho, "VQABG: Vietnamese question/answers benchmark generator for field-specific chatbot ground-truth dataset using EMINI (Exact Match wIth Numeric Information) indicator," CTU Journal of Innovation and Sustainable Development, vol. 16, no. Special Issue: ISDS, pp. 80–90, 2024. doi: 10.22144/ctujoisd.2024.325.</w:t>
       </w:r>
     </w:p>
     <w:sectPr>
@@ -8307,7 +8311,7 @@
 </file>
 
 <file path=customXml/itemProps1.xml><?xml version="1.0" encoding="utf-8"?>
-<ds:datastoreItem xmlns:ds="http://schemas.openxmlformats.org/officeDocument/2006/customXml" ds:itemID="{759B2BB9-2E56-4AA7-8579-A161D47E0996}">
+<ds:datastoreItem xmlns:ds="http://schemas.openxmlformats.org/officeDocument/2006/customXml" ds:itemID="{03D28D27-A260-4006-967A-3CFE65719B39}">
   <ds:schemaRefs>
     <ds:schemaRef ds:uri="http://schemas.openxmlformats.org/officeDocument/2006/bibliography"/>
   </ds:schemaRefs>

</xml_diff>